<commit_message>
docs(anexos): roteiro, nota tecnica e instrucoes A/B com nomenclatura e status aprovados (LOG #69)
- guia-validacao-local-mariah.docx e nota-tecnica-premissas-mariah.docx:
  "Caderno 2 (do Guia)" -> "documento MARIAH" (4 + 5 ocorrencias);
  demais textos intocados; validados (schema OOXML).
- instrucoes-preenchimento-versao-a/b: regeneradas pelo gerador (reproducao
  byte-textual conferida antes da mudanca); unica linha alterada:
  "Versao preliminar - em revisao pelo GT" -> "Versao aprovada pela INAEP em
  16/09/2026 - em revisao editorial para publicacao".
- Datas de edicao das notas (Junho/Julho de 2026, "Versao preliminar")
  mantidas como registro historico - a decidir pela Direcao.

Co-Authored-By: Claude Opus 5.5 <noreply@anthropic.com>
Claude-Session: https://claude.ai/code/session_01EMCqDJHEYDPdwky1vKevpy
</commit_message>
<xml_diff>
--- a/public/guia-validacao-local-mariah.docx
+++ b/public/guia-validacao-local-mariah.docx
@@ -18,7 +18,7 @@
           <w:sz w:val="32"/>
           <w:szCs w:val="32"/>
         </w:rPr>
-        <w:t>VALIDAÇÃO LOCAL DA MARIAH (CADERNO 2)</w:t>
+        <w:t>VALIDAÇÃO LOCAL DA MARIAH (DOCUMENTO MARIAH)</w:t>
       </w:r>
     </w:p>
     <w:p>
@@ -98,7 +98,7 @@
                 <w:b/>
                 <w:bCs/>
               </w:rPr>
-              <w:t>Quadro F.1  Guia de leitura da Validação Local (Caderno 2)</w:t>
+              <w:t>Quadro F.1  Guia de leitura da Validação Local (documento MARIAH)</w:t>
             </w:r>
           </w:p>
           <w:p>
@@ -114,31 +114,7 @@
               <w:rPr>
                 <w:rFonts w:ascii="Times New Roman" w:hAnsi="Times New Roman" w:cs="Times New Roman"/>
               </w:rPr>
-              <w:t xml:space="preserve">Esta Seção oferece um roteiro prático para Comitês de Ética em Pesquisa que decidam, por iniciativa institucional própria, validar a Matriz MARIAH na sua casuística. Não há plano nacional centralizado, não há adesão formal a consórcio, não há prazo de execução. Cada CEP roda o que lhe for útil, no ritmo que lhe couber. O retorno de resultados ao Grupo de Trabalho responsável pelo guia é facultativo e serve à evolução futura do instrumento. As três frentes propostas em F.2 </w:t>
-            </w:r>
-            <w:r>
-              <w:rPr>
-                <w:rFonts w:ascii="Times New Roman" w:hAnsi="Times New Roman" w:cs="Times New Roman"/>
-              </w:rPr>
-              <w:t>(</w:t>
-            </w:r>
-            <w:r>
-              <w:rPr>
-                <w:rFonts w:ascii="Times New Roman" w:hAnsi="Times New Roman" w:cs="Times New Roman"/>
-              </w:rPr>
-              <w:t>concordância entre avaliadores, distribuição empírica dos protocolos e convergência entre as duas versões da matriz</w:t>
-            </w:r>
-            <w:r>
-              <w:rPr>
-                <w:rFonts w:ascii="Times New Roman" w:hAnsi="Times New Roman" w:cs="Times New Roman"/>
-              </w:rPr>
-              <w:t>)</w:t>
-            </w:r>
-            <w:r>
-              <w:rPr>
-                <w:rFonts w:ascii="Times New Roman" w:hAnsi="Times New Roman" w:cs="Times New Roman"/>
-              </w:rPr>
-              <w:t xml:space="preserve"> podem ser executadas em conjunto ou separadamente. A planilha-modelo que acompanha esta Seção automatiza o registro e o cálculo dos indicadores e dispensa o uso de qualquer software estatístico especializado.</w:t>
+              <w:t xml:space="preserve">Esta Seção oferece um roteiro prático para Comitês de Ética em Pesquisa que decidam, por iniciativa institucional própria, validar a Matriz MARIAH na sua casuística. Não há plano nacional centralizado, não há adesão formal a consórcio, não há prazo de execução. Cada CEP roda o que lhe for útil, no ritmo que lhe couber. O retorno de resultados ao Grupo de Trabalho responsável pelo guia é facultativo e serve à evolução futura do instrumento. As três frentes propostas em F.2 (concordância entre avaliadores, distribuição empírica dos protocolos e convergência entre as duas versões da matriz) podem ser executadas em conjunto ou separadamente. A planilha-modelo que acompanha esta Seção automatiza o registro e o cálculo dos indicadores e dispensa o uso de qualquer software estatístico especializado.</w:t>
             </w:r>
           </w:p>
         </w:tc>
@@ -214,46 +190,7 @@
           <w:sz w:val="24"/>
           <w:szCs w:val="24"/>
         </w:rPr>
-        <w:t>Há três razões pelas quais um CEP pode querer fazer essa validação.</w:t>
-      </w:r>
-      <w:r>
-        <w:rPr>
-          <w:rFonts w:ascii="Times New Roman" w:hAnsi="Times New Roman" w:cs="Times New Roman"/>
-          <w:b w:val="0"/>
-          <w:bCs w:val="0"/>
-          <w:sz w:val="24"/>
-          <w:szCs w:val="24"/>
-        </w:rPr>
-        <w:t xml:space="preserve"> </w:t>
-      </w:r>
-      <w:r>
-        <w:rPr>
-          <w:rFonts w:ascii="Times New Roman" w:hAnsi="Times New Roman" w:cs="Times New Roman"/>
-          <w:b w:val="0"/>
-          <w:bCs w:val="0"/>
-          <w:sz w:val="24"/>
-          <w:szCs w:val="24"/>
-        </w:rPr>
-        <w:t>A primeira é o aprendizado institucional. A aplicação sistemática da matriz por dois ou mais membros do colegiado revela rapidamente quais perguntas estão sendo interpretadas de forma divergente, oferecendo insumo direto para a capacitação deliberativa descrita no Caderno 2 do Guia</w:t>
-      </w:r>
-      <w:r>
-        <w:rPr>
-          <w:rFonts w:ascii="Times New Roman" w:hAnsi="Times New Roman" w:cs="Times New Roman"/>
-          <w:b w:val="0"/>
-          <w:bCs w:val="0"/>
-          <w:sz w:val="24"/>
-          <w:szCs w:val="24"/>
-        </w:rPr>
-        <w:t xml:space="preserve">. A segunda é de qualificação institucional do parecer. Um CEP que demonstre, com base na sua própria casuística, que aplica a MARIAH de modo consistente entre avaliadores, fortalece a credibilidade dos seus pareceres em protocolos com inteligência artificial perante pesquisadores, patrocinadores e a sociedade. A terceira é de contribuição opcional à evolução do instrumento. Os pontos de corte atuais da Versão B são, conforme o próprio Guia reconhece, calibrações teóricas que </w:t>
-      </w:r>
-      <w:r>
-        <w:rPr>
-          <w:rFonts w:ascii="Times New Roman" w:hAnsi="Times New Roman" w:cs="Times New Roman"/>
-          <w:b w:val="0"/>
-          <w:bCs w:val="0"/>
-          <w:sz w:val="24"/>
-          <w:szCs w:val="24"/>
-        </w:rPr>
+        <w:t xml:space="preserve">Há três razões pelas quais um CEP pode querer fazer essa validação. A primeira é o aprendizado institucional. A aplicação sistemática da matriz por dois ou mais membros do colegiado revela rapidamente quais perguntas estão sendo interpretadas de forma divergente, oferecendo insumo direto para a capacitação deliberativa descrita no documento MARIAH. A segunda é de qualificação institucional do parecer. Um CEP que demonstre, com base na sua própria casuística, que aplica a MARIAH de modo consistente entre avaliadores, fortalece a credibilidade dos seus pareceres em protocolos com inteligência artificial perante pesquisadores, patrocinadores e a sociedade. A terceira é de contribuição opcional à evolução do instrumento. Os pontos de corte atuais da Versão B são, conforme o próprio Guia reconhece, calibrações teóricas que </w:t>
         <w:lastRenderedPageBreak/>
         <w:t>merecem ser testadas empiricamente. CEPs que queiram compartilhar suas observações com o Grupo de Trabalho responsável pelo guia podem fazê-lo pelo canal descrito em F.5.</w:t>
       </w:r>
@@ -378,27 +315,7 @@
           <w:sz w:val="24"/>
           <w:szCs w:val="24"/>
         </w:rPr>
-        <w:t xml:space="preserve">A primeira frente verifica se dois ou mais </w:t>
-      </w:r>
-      <w:r>
-        <w:rPr>
-          <w:rFonts w:ascii="Times New Roman" w:hAnsi="Times New Roman" w:cs="Times New Roman"/>
-          <w:b w:val="0"/>
-          <w:bCs w:val="0"/>
-          <w:sz w:val="24"/>
-          <w:szCs w:val="24"/>
-        </w:rPr>
-        <w:t>integrantes</w:t>
-      </w:r>
-      <w:r>
-        <w:rPr>
-          <w:rFonts w:ascii="Times New Roman" w:hAnsi="Times New Roman" w:cs="Times New Roman"/>
-          <w:b w:val="0"/>
-          <w:bCs w:val="0"/>
-          <w:sz w:val="24"/>
-          <w:szCs w:val="24"/>
-        </w:rPr>
-        <w:t xml:space="preserve"> do CEP, ao aplicarem a Versão A da MARIAH ao mesmo protocolo de forma independente, chegam à mesma classificação. É a frente operacionalmente mais simples e a que rende, do ponto de vista de aprendizado institucional, o retorno mais imediato. O colegiado descobre rapidamente em quais eixos há leitura convergente e em quais há discordância sistemática, o que orienta diretamente o que precisa ser conversado em reunião plenária.</w:t>
+        <w:t xml:space="preserve">A primeira frente verifica se dois ou mais integrantes do CEP, ao aplicarem a Versão A da MARIAH ao mesmo protocolo de forma independente, chegam à mesma classificação. É a frente operacionalmente mais simples e a que rende, do ponto de vista de aprendizado institucional, o retorno mais imediato. O colegiado descobre rapidamente em quais eixos há leitura convergente e em quais há discordância sistemática, o que orienta diretamente o que precisa ser conversado em reunião plenária.</w:t>
       </w:r>
     </w:p>
     <w:p>
@@ -476,38 +393,9 @@
           <w:sz w:val="24"/>
           <w:szCs w:val="24"/>
         </w:rPr>
-        <w:t xml:space="preserve">A segunda frente examina como os protocolos avaliados pelo CEP se distribuem nos quatro níveis da MARIAH. Há dois usos principais para essa informação. O primeiro é descritivo. O CEP passa a conhecer o perfil da sua casuística em pesquisa com inteligência artificial: se a maioria dos protocolos se concentra no Nível II, se há protocolos no Nível IV, se a distribuição mudou ao longo do tempo. Essa informação é insumo de planejamento institucional e de capacitação do colegiado. O segundo uso é diagnóstico. </w:t>
-      </w:r>
-      <w:r>
-        <w:rPr>
-          <w:rFonts w:ascii="Times New Roman" w:hAnsi="Times New Roman" w:cs="Times New Roman"/>
-          <w:b w:val="0"/>
-          <w:bCs w:val="0"/>
-          <w:sz w:val="24"/>
-          <w:szCs w:val="24"/>
-        </w:rPr>
-        <w:t xml:space="preserve">Quando a distribuição se concentra perto de um ponto de corte da </w:t>
-      </w:r>
-      <w:r>
-        <w:rPr>
-          <w:rFonts w:ascii="Times New Roman" w:hAnsi="Times New Roman" w:cs="Times New Roman"/>
-          <w:b w:val="0"/>
-          <w:bCs w:val="0"/>
-          <w:sz w:val="24"/>
-          <w:szCs w:val="24"/>
-        </w:rPr>
+        <w:t xml:space="preserve">A segunda frente examina como os protocolos avaliados pelo CEP se distribuem nos quatro níveis da MARIAH. Há dois usos principais para essa informação. O primeiro é descritivo. O CEP passa a conhecer o perfil da sua casuística em pesquisa com inteligência artificial: se a maioria dos protocolos se concentra no Nível II, se há protocolos no Nível IV, se a distribuição mudou ao longo do tempo. Essa informação é insumo de planejamento institucional e de capacitação do colegiado. O segundo uso é diagnóstico. Quando a distribuição se concentra perto de um ponto de corte da </w:t>
         <w:lastRenderedPageBreak/>
-        <w:t>Versão B, o colegiado tem evidência local de que pequenas variações na pontuação podem deslocar muitos protocolos de nível, o que justifica examinar com mais atenção os casos limítrofes</w:t>
-      </w:r>
-      <w:r>
-        <w:rPr>
-          <w:rFonts w:ascii="Times New Roman" w:hAnsi="Times New Roman" w:cs="Times New Roman"/>
-          <w:b w:val="0"/>
-          <w:bCs w:val="0"/>
-          <w:sz w:val="24"/>
-          <w:szCs w:val="24"/>
-        </w:rPr>
-        <w:t>.</w:t>
+        <w:t>Versão B, o colegiado tem evidência local de que pequenas variações na pontuação podem deslocar muitos protocolos de nível, o que justifica examinar com mais atenção os casos limítrofes.</w:t>
       </w:r>
     </w:p>
     <w:p>
@@ -585,47 +473,7 @@
           <w:sz w:val="24"/>
           <w:szCs w:val="24"/>
         </w:rPr>
-        <w:t xml:space="preserve">A terceira frente examina se a Versão A e a Versão B, aplicadas ao mesmo protocolo no modo triagem previsto pelo Guia, convergem para a mesma classificação de risco. Quando o CEP usa rotineiramente o modo triagem </w:t>
-      </w:r>
-      <w:r>
-        <w:rPr>
-          <w:rFonts w:ascii="Times New Roman" w:hAnsi="Times New Roman" w:cs="Times New Roman"/>
-          <w:b w:val="0"/>
-          <w:bCs w:val="0"/>
-          <w:sz w:val="24"/>
-          <w:szCs w:val="24"/>
-        </w:rPr>
-        <w:t>(</w:t>
-      </w:r>
-      <w:r>
-        <w:rPr>
-          <w:rFonts w:ascii="Times New Roman" w:hAnsi="Times New Roman" w:cs="Times New Roman"/>
-          <w:b w:val="0"/>
-          <w:bCs w:val="0"/>
-          <w:sz w:val="24"/>
-          <w:szCs w:val="24"/>
-        </w:rPr>
-        <w:t>Versão A como filtro inicial e Versão B em casos de Nível III ou Nível IV</w:t>
-      </w:r>
-      <w:r>
-        <w:rPr>
-          <w:rFonts w:ascii="Times New Roman" w:hAnsi="Times New Roman" w:cs="Times New Roman"/>
-          <w:b w:val="0"/>
-          <w:bCs w:val="0"/>
-          <w:sz w:val="24"/>
-          <w:szCs w:val="24"/>
-        </w:rPr>
-        <w:t>)</w:t>
-      </w:r>
-      <w:r>
-        <w:rPr>
-          <w:rFonts w:ascii="Times New Roman" w:hAnsi="Times New Roman" w:cs="Times New Roman"/>
-          <w:b w:val="0"/>
-          <w:bCs w:val="0"/>
-          <w:sz w:val="24"/>
-          <w:szCs w:val="24"/>
-        </w:rPr>
-        <w:t xml:space="preserve"> basta registrar as duas classificações em paralelo. Discordâncias sistemáticas entre as duas versões, quando ocorrem, são informação valiosa: ou indicam que o CEP está lendo de modo inconsistente as duas versões, ou indicam que as duas versões captam dimensões diferentes do risco no protocolo. Em ambos os casos, o colegiado tem material concreto para discutir e, se for o caso, reportar ao Grupo de Trabalho.</w:t>
+        <w:t xml:space="preserve">A terceira frente examina se a Versão A e a Versão B, aplicadas ao mesmo protocolo no modo triagem previsto pelo Guia, convergem para a mesma classificação de risco. Quando o CEP usa rotineiramente o modo triagem (Versão A como filtro inicial e Versão B em casos de Nível III ou Nível IV) basta registrar as duas classificações em paralelo. Discordâncias sistemáticas entre as duas versões, quando ocorrem, são informação valiosa: ou indicam que o CEP está lendo de modo inconsistente as duas versões, ou indicam que as duas versões captam dimensões diferentes do risco no protocolo. Em ambos os casos, o colegiado tem material concreto para discutir e, se for o caso, reportar ao Grupo de Trabalho.</w:t>
       </w:r>
     </w:p>
     <w:p>
@@ -713,27 +561,7 @@
           <w:sz w:val="24"/>
           <w:szCs w:val="24"/>
         </w:rPr>
-        <w:t>O primeiro passo é definir o período de coleta. Pode ser um trimestre, um semestre ou aberto. O importante é o CEP saber que, durante esse período, os protocolos com inteligência artificial recebidos serão objeto também do exercício de validação, em paralelo ao parecer ordinário. A coleta não altera o fluxo do parecer institucional</w:t>
-      </w:r>
-      <w:r>
-        <w:rPr>
-          <w:rFonts w:ascii="Times New Roman" w:hAnsi="Times New Roman" w:cs="Times New Roman"/>
-          <w:b w:val="0"/>
-          <w:bCs w:val="0"/>
-          <w:sz w:val="24"/>
-          <w:szCs w:val="24"/>
-        </w:rPr>
-        <w:t xml:space="preserve"> do SINEP</w:t>
-      </w:r>
-      <w:r>
-        <w:rPr>
-          <w:rFonts w:ascii="Times New Roman" w:hAnsi="Times New Roman" w:cs="Times New Roman"/>
-          <w:b w:val="0"/>
-          <w:bCs w:val="0"/>
-          <w:sz w:val="24"/>
-          <w:szCs w:val="24"/>
-        </w:rPr>
-        <w:t>.</w:t>
+        <w:t xml:space="preserve">O primeiro passo é definir o período de coleta. Pode ser um trimestre, um semestre ou aberto. O importante é o CEP saber que, durante esse período, os protocolos com inteligência artificial recebidos serão objeto também do exercício de validação, em paralelo ao parecer ordinário. A coleta não altera o fluxo do parecer institucional do SINEP.</w:t>
       </w:r>
     </w:p>
     <w:p>
@@ -785,15 +613,6 @@
           <w:szCs w:val="24"/>
         </w:rPr>
         <w:t xml:space="preserve">O terceiro passo é registrar as avaliações na planilha-modelo. A planilha tem aba específica para cada frente. Cada protocolo recebe um identificador interno do CEP que dispensa qualquer </w:t>
-      </w:r>
-      <w:r>
-        <w:rPr>
-          <w:rFonts w:ascii="Times New Roman" w:hAnsi="Times New Roman" w:cs="Times New Roman"/>
-          <w:b w:val="0"/>
-          <w:bCs w:val="0"/>
-          <w:sz w:val="24"/>
-          <w:szCs w:val="24"/>
-        </w:rPr>
         <w:lastRenderedPageBreak/>
         <w:t>informação que permita identificar pesquisador, instituição proponente ou patrocinador. A planilha não pede esses dados. O registro mínimo é o identificador, a data e as respostas dos avaliadores nas perguntas da matriz. As fórmulas calculam a classificação consolidada, a pontuação total e os indicadores agregados das três frentes.</w:t>
       </w:r>
@@ -1167,23 +986,7 @@
                 <w:sz w:val="20"/>
                 <w:szCs w:val="20"/>
               </w:rPr>
-              <w:t>Concordância moderada. Identifique os casos de discordância e use-os como pauta de reunião</w:t>
-            </w:r>
-            <w:r>
-              <w:rPr>
-                <w:rFonts w:ascii="Times New Roman" w:hAnsi="Times New Roman" w:cs="Times New Roman"/>
-                <w:sz w:val="20"/>
-                <w:szCs w:val="20"/>
-              </w:rPr>
-              <w:t>, porque</w:t>
-            </w:r>
-            <w:r>
-              <w:rPr>
-                <w:rFonts w:ascii="Times New Roman" w:hAnsi="Times New Roman" w:cs="Times New Roman"/>
-                <w:sz w:val="20"/>
-                <w:szCs w:val="20"/>
-              </w:rPr>
-              <w:t xml:space="preserve"> são exatamente os casos limítrofes que o Guia trata ao abordar a formação dos comitês.</w:t>
+              <w:t xml:space="preserve">Concordância moderada. Identifique os casos de discordância e use-os como pauta de reunião, porque são exatamente os casos limítrofes que o Guia trata ao abordar a formação dos comitês.</w:t>
             </w:r>
           </w:p>
         </w:tc>
@@ -1375,19 +1178,7 @@
           <w:rFonts w:ascii="Times New Roman" w:hAnsi="Times New Roman" w:cs="Times New Roman"/>
         </w:rPr>
         <w:lastRenderedPageBreak/>
-        <w:t xml:space="preserve">Para a frente de distribuição empírica, a leitura é visual. </w:t>
-      </w:r>
-      <w:r>
-        <w:rPr>
-          <w:rFonts w:ascii="Times New Roman" w:hAnsi="Times New Roman" w:cs="Times New Roman"/>
-        </w:rPr>
-        <w:t xml:space="preserve">O colegiado analisa o histograma da planilha para verificar a concentração de protocolos em algum nível, a proximidade com os pontos de corte e a presença de bimodalidade (dois picos separados por um vale). </w:t>
-      </w:r>
-      <w:r>
-        <w:rPr>
-          <w:rFonts w:ascii="Times New Roman" w:hAnsi="Times New Roman" w:cs="Times New Roman"/>
-        </w:rPr>
-        <w:t>Concentração próxima aos pontos de corte é alerta de que pequenas variações na aplicação da matriz produzem mudanças de nível. Bimodalidade marcada é evidência local de que o ponto de corte natural na casuística do CEP pode diferir do ponto teórico vigente.</w:t>
+        <w:t xml:space="preserve">Para a frente de distribuição empírica, a leitura é visual. O colegiado analisa o histograma da planilha para verificar a concentração de protocolos em algum nível, a proximidade com os pontos de corte e a presença de bimodalidade (dois picos separados por um vale). Concentração próxima aos pontos de corte é alerta de que pequenas variações na aplicação da matriz produzem mudanças de nível. Bimodalidade marcada é evidência local de que o ponto de corte natural na casuística do CEP pode diferir do ponto teórico vigente.</w:t>
       </w:r>
     </w:p>
     <w:p>
@@ -1471,27 +1262,7 @@
           <w:sz w:val="24"/>
           <w:szCs w:val="24"/>
         </w:rPr>
-        <w:t>CEPs que decidirem compartilhar suas observações com o Grupo de Trabalho responsável pelo guia podem fazê-lo a qualquer momento</w:t>
-      </w:r>
-      <w:r>
-        <w:rPr>
-          <w:rFonts w:ascii="Times New Roman" w:hAnsi="Times New Roman" w:cs="Times New Roman"/>
-          <w:b w:val="0"/>
-          <w:bCs w:val="0"/>
-          <w:sz w:val="24"/>
-          <w:szCs w:val="24"/>
-        </w:rPr>
-        <w:t xml:space="preserve"> por meio da Secretaria Executiva da INAEP (se.inaep@saude.gov.br)</w:t>
-      </w:r>
-      <w:r>
-        <w:rPr>
-          <w:rFonts w:ascii="Times New Roman" w:hAnsi="Times New Roman" w:cs="Times New Roman"/>
-          <w:b w:val="0"/>
-          <w:bCs w:val="0"/>
-          <w:sz w:val="24"/>
-          <w:szCs w:val="24"/>
-        </w:rPr>
-        <w:t>. Não há prazo, não há formulário obrigatório, não há contrapartida institucional. O compartilhamento é ato voluntário, e seu único propósito é informar a evolução futura do instrumento.</w:t>
+        <w:t xml:space="preserve">CEPs que decidirem compartilhar suas observações com o Grupo de Trabalho responsável pelo guia podem fazê-lo a qualquer momento por meio da Secretaria Executiva da INAEP (se.inaep@saude.gov.br). Não há prazo, não há formulário obrigatório, não há contrapartida institucional. O compartilhamento é ato voluntário, e seu único propósito é informar a evolução futura do instrumento.</w:t>
       </w:r>
     </w:p>
     <w:p>

</xml_diff>